<commit_message>
Sejajarkan indentasi isi naskah dengan garis penomoran judulnya
Paragraf isi sebelumnya duduk di margin kiri tanpa indentasi baris pertama,
sehingga terlihat lepas dari sub bab di atasnya. Sekarang batas kiri paragraf
disejajarkan dengan garis penomoran judul induknya -- isi di bawah "1." mulai
dari 0,8 cm, di bawah "a." dari 1,6 cm -- dan baris pertamanya tetap menjorok
1,27 cm. Gaya baru: Isi1, Isi2, Isian1, Isian2.

Indentasi kutipan panjang tidak ikut digeser karena pedoman mematoknya pada
1,27 cm dan 0,5 cm dari margin kiri, bukan dari indentasi paragraf induk.

Daftar ucapan terima kasih di Kata Pengantar juga dipindah ke penomoran bawaan
Word, menyusul bab dan sub bab yang sudah lebih dulu memakainya.

Co-Authored-By: Claude Opus 5 <noreply@anthropic.com>
</commit_message>
<xml_diff>
--- a/public/template/template-penulisan-skripsi.docx
+++ b/public/template/template-penulisan-skripsi.docx
@@ -2089,56 +2089,74 @@
     </w:p>
     <w:p>
       <w:pPr>
-        <w:pStyle w:val="Isian"/>
-        <w:ind w:firstLine="0"/>
-      </w:pPr>
-      <w:r>
-        <w:t xml:space="preserve">[1.  Bapak/Ibu ... selaku Dekan Fakultas Syariah dan Hukum UIN Syarif Hidayatullah Jakarta;]</w:t>
-      </w:r>
-    </w:p>
-    <w:p>
-      <w:pPr>
-        <w:pStyle w:val="Isian"/>
-        <w:ind w:firstLine="0"/>
-      </w:pPr>
-      <w:r>
-        <w:t xml:space="preserve">[2.  Bapak/Ibu ... selaku Ketua dan Sekretaris Program Studi Hukum Ekonomi Syariah;]</w:t>
-      </w:r>
-    </w:p>
-    <w:p>
-      <w:pPr>
-        <w:pStyle w:val="Isian"/>
-        <w:ind w:firstLine="0"/>
-      </w:pPr>
-      <w:r>
-        <w:t xml:space="preserve">[3.  Bapak/Ibu ... selaku dosen pembimbing skripsi;]</w:t>
-      </w:r>
-    </w:p>
-    <w:p>
-      <w:pPr>
-        <w:pStyle w:val="Isian"/>
-        <w:ind w:firstLine="0"/>
-      </w:pPr>
-      <w:r>
-        <w:t xml:space="preserve">[4.  Lembaga atau instansi tempat penelitian dilakukan;]</w:t>
-      </w:r>
-    </w:p>
-    <w:p>
-      <w:pPr>
-        <w:pStyle w:val="Isian"/>
-        <w:ind w:firstLine="0"/>
-      </w:pPr>
-      <w:r>
-        <w:t xml:space="preserve">[5.  Pimpinan dan staf Perpustakaan FSH serta Perpustakaan Utama UIN Syarif Hidayatullah Jakarta;]</w:t>
-      </w:r>
-    </w:p>
-    <w:p>
-      <w:pPr>
-        <w:pStyle w:val="Isian"/>
-        <w:ind w:firstLine="0"/>
-      </w:pPr>
-      <w:r>
-        <w:t xml:space="preserve">[6.  Pihak lain yang telah memberi kontribusi dalam penyelesaian karya tulis ini.]</w:t>
+        <w:pStyle w:val="ButirIsian"/>
+        <w:numPr>
+          <w:ilvl w:val="0"/>
+          <w:numId w:val="2"/>
+        </w:numPr>
+      </w:pPr>
+      <w:r>
+        <w:t xml:space="preserve">[Bapak/Ibu ... selaku Dekan Fakultas Syariah dan Hukum UIN Syarif Hidayatullah Jakarta;]</w:t>
+      </w:r>
+    </w:p>
+    <w:p>
+      <w:pPr>
+        <w:pStyle w:val="ButirIsian"/>
+        <w:numPr>
+          <w:ilvl w:val="0"/>
+          <w:numId w:val="2"/>
+        </w:numPr>
+      </w:pPr>
+      <w:r>
+        <w:t xml:space="preserve">[Bapak/Ibu ... selaku Ketua dan Sekretaris Program Studi Hukum Ekonomi Syariah;]</w:t>
+      </w:r>
+    </w:p>
+    <w:p>
+      <w:pPr>
+        <w:pStyle w:val="ButirIsian"/>
+        <w:numPr>
+          <w:ilvl w:val="0"/>
+          <w:numId w:val="2"/>
+        </w:numPr>
+      </w:pPr>
+      <w:r>
+        <w:t xml:space="preserve">[Bapak/Ibu ... selaku dosen pembimbing skripsi;]</w:t>
+      </w:r>
+    </w:p>
+    <w:p>
+      <w:pPr>
+        <w:pStyle w:val="ButirIsian"/>
+        <w:numPr>
+          <w:ilvl w:val="0"/>
+          <w:numId w:val="2"/>
+        </w:numPr>
+      </w:pPr>
+      <w:r>
+        <w:t xml:space="preserve">[Lembaga atau instansi tempat penelitian dilakukan;]</w:t>
+      </w:r>
+    </w:p>
+    <w:p>
+      <w:pPr>
+        <w:pStyle w:val="ButirIsian"/>
+        <w:numPr>
+          <w:ilvl w:val="0"/>
+          <w:numId w:val="2"/>
+        </w:numPr>
+      </w:pPr>
+      <w:r>
+        <w:t xml:space="preserve">[Pimpinan dan staf Perpustakaan FSH serta Perpustakaan Utama UIN Syarif Hidayatullah Jakarta;]</w:t>
+      </w:r>
+    </w:p>
+    <w:p>
+      <w:pPr>
+        <w:pStyle w:val="ButirIsian"/>
+        <w:numPr>
+          <w:ilvl w:val="0"/>
+          <w:numId w:val="2"/>
+        </w:numPr>
+      </w:pPr>
+      <w:r>
+        <w:t xml:space="preserve">[Pihak lain yang telah memberi kontribusi dalam penyelesaian karya tulis ini.]</w:t>
       </w:r>
     </w:p>
     <w:p>
@@ -2933,7 +2951,7 @@
         <w:pStyle w:val="NomorBab"/>
         <w:numPr>
           <w:ilvl w:val="0"/>
-          <w:numId w:val="2"/>
+          <w:numId w:val="3"/>
         </w:numPr>
       </w:pPr>
     </w:p>
@@ -2969,7 +2987,7 @@
         <w:pStyle w:val="SubA"/>
         <w:numPr>
           <w:ilvl w:val="0"/>
-          <w:numId w:val="3"/>
+          <w:numId w:val="4"/>
         </w:numPr>
       </w:pPr>
       <w:r>
@@ -3031,7 +3049,7 @@
         <w:pStyle w:val="SubA"/>
         <w:numPr>
           <w:ilvl w:val="0"/>
-          <w:numId w:val="3"/>
+          <w:numId w:val="4"/>
         </w:numPr>
       </w:pPr>
       <w:r>
@@ -3061,7 +3079,7 @@
         <w:pStyle w:val="Sub1"/>
         <w:numPr>
           <w:ilvl w:val="1"/>
-          <w:numId w:val="3"/>
+          <w:numId w:val="4"/>
         </w:numPr>
       </w:pPr>
       <w:r>
@@ -3091,7 +3109,7 @@
         <w:pStyle w:val="ButirIsian"/>
         <w:numPr>
           <w:ilvl w:val="2"/>
-          <w:numId w:val="3"/>
+          <w:numId w:val="4"/>
         </w:numPr>
       </w:pPr>
       <w:r>
@@ -3103,7 +3121,7 @@
         <w:pStyle w:val="ButirIsian"/>
         <w:numPr>
           <w:ilvl w:val="2"/>
-          <w:numId w:val="3"/>
+          <w:numId w:val="4"/>
         </w:numPr>
       </w:pPr>
       <w:r>
@@ -3115,7 +3133,7 @@
         <w:pStyle w:val="ButirIsian"/>
         <w:numPr>
           <w:ilvl w:val="2"/>
-          <w:numId w:val="3"/>
+          <w:numId w:val="4"/>
         </w:numPr>
       </w:pPr>
       <w:r>
@@ -3127,7 +3145,7 @@
         <w:pStyle w:val="ButirIsian"/>
         <w:numPr>
           <w:ilvl w:val="2"/>
-          <w:numId w:val="3"/>
+          <w:numId w:val="4"/>
         </w:numPr>
       </w:pPr>
       <w:r>
@@ -3139,7 +3157,7 @@
         <w:pStyle w:val="Sub1"/>
         <w:numPr>
           <w:ilvl w:val="1"/>
-          <w:numId w:val="3"/>
+          <w:numId w:val="4"/>
         </w:numPr>
       </w:pPr>
       <w:r>
@@ -3166,7 +3184,7 @@
     </w:p>
     <w:p>
       <w:pPr>
-        <w:pStyle w:val="Isian"/>
+        <w:pStyle w:val="Isian1"/>
       </w:pPr>
       <w:r>
         <w:t xml:space="preserve">[Uraian pembatasan beserta alasan setiap butirnya.]</w:t>
@@ -3177,7 +3195,7 @@
         <w:pStyle w:val="Sub1"/>
         <w:numPr>
           <w:ilvl w:val="1"/>
-          <w:numId w:val="3"/>
+          <w:numId w:val="4"/>
         </w:numPr>
       </w:pPr>
       <w:r>
@@ -3204,7 +3222,7 @@
     </w:p>
     <w:p>
       <w:pPr>
-        <w:pStyle w:val="Isian"/>
+        <w:pStyle w:val="Isian1"/>
       </w:pPr>
       <w:r>
         <w:t xml:space="preserve">[Pernyataan masalah pokok — satu saja, berbentuk pernyataan.]</w:t>
@@ -3212,7 +3230,7 @@
     </w:p>
     <w:p>
       <w:pPr>
-        <w:pStyle w:val="IsiTanpaIndent"/>
+        <w:pStyle w:val="Isi1"/>
       </w:pPr>
       <w:r>
         <w:t xml:space="preserve">Masalah pokok tersebut penulis rinci dalam bentuk pertanyaan penelitian sebagai berikut:</w:t>
@@ -3223,7 +3241,7 @@
         <w:pStyle w:val="ButirIsian"/>
         <w:numPr>
           <w:ilvl w:val="2"/>
-          <w:numId w:val="3"/>
+          <w:numId w:val="4"/>
         </w:numPr>
       </w:pPr>
       <w:r>
@@ -3235,7 +3253,7 @@
         <w:pStyle w:val="ButirIsian"/>
         <w:numPr>
           <w:ilvl w:val="2"/>
-          <w:numId w:val="3"/>
+          <w:numId w:val="4"/>
         </w:numPr>
       </w:pPr>
       <w:r>
@@ -3247,7 +3265,7 @@
         <w:pStyle w:val="SubA"/>
         <w:numPr>
           <w:ilvl w:val="0"/>
-          <w:numId w:val="3"/>
+          <w:numId w:val="4"/>
         </w:numPr>
       </w:pPr>
       <w:r>
@@ -3259,7 +3277,7 @@
         <w:pStyle w:val="Sub1"/>
         <w:numPr>
           <w:ilvl w:val="1"/>
-          <w:numId w:val="3"/>
+          <w:numId w:val="4"/>
         </w:numPr>
       </w:pPr>
       <w:r>
@@ -3289,7 +3307,7 @@
         <w:pStyle w:val="ButirIsian"/>
         <w:numPr>
           <w:ilvl w:val="2"/>
-          <w:numId w:val="3"/>
+          <w:numId w:val="4"/>
         </w:numPr>
       </w:pPr>
       <w:r>
@@ -3301,7 +3319,7 @@
         <w:pStyle w:val="ButirIsian"/>
         <w:numPr>
           <w:ilvl w:val="2"/>
-          <w:numId w:val="3"/>
+          <w:numId w:val="4"/>
         </w:numPr>
       </w:pPr>
       <w:r>
@@ -3313,7 +3331,7 @@
         <w:pStyle w:val="Sub1"/>
         <w:numPr>
           <w:ilvl w:val="1"/>
-          <w:numId w:val="3"/>
+          <w:numId w:val="4"/>
         </w:numPr>
       </w:pPr>
       <w:r>
@@ -3343,7 +3361,7 @@
         <w:pStyle w:val="Suba"/>
         <w:numPr>
           <w:ilvl w:val="2"/>
-          <w:numId w:val="3"/>
+          <w:numId w:val="4"/>
         </w:numPr>
       </w:pPr>
       <w:r>
@@ -3352,7 +3370,7 @@
     </w:p>
     <w:p>
       <w:pPr>
-        <w:pStyle w:val="Isian"/>
+        <w:pStyle w:val="Isian2"/>
       </w:pPr>
       <w:r>
         <w:t xml:space="preserve">[Sumbangan keilmuan dari hasil penelitian ini.]</w:t>
@@ -3363,7 +3381,7 @@
         <w:pStyle w:val="Suba"/>
         <w:numPr>
           <w:ilvl w:val="2"/>
-          <w:numId w:val="3"/>
+          <w:numId w:val="4"/>
         </w:numPr>
       </w:pPr>
       <w:r>
@@ -3372,7 +3390,7 @@
     </w:p>
     <w:p>
       <w:pPr>
-        <w:pStyle w:val="Isian"/>
+        <w:pStyle w:val="Isian2"/>
       </w:pPr>
       <w:r>
         <w:t xml:space="preserve">[Kegunaan konkret dan bagi siapa: lembaga yang diteliti, regulator, praktisi, masyarakat, atau peneliti berikutnya.]</w:t>
@@ -3383,7 +3401,7 @@
         <w:pStyle w:val="SubA"/>
         <w:numPr>
           <w:ilvl w:val="0"/>
-          <w:numId w:val="3"/>
+          <w:numId w:val="4"/>
         </w:numPr>
       </w:pPr>
       <w:r>
@@ -3413,7 +3431,7 @@
         <w:pStyle w:val="Sub1"/>
         <w:numPr>
           <w:ilvl w:val="1"/>
-          <w:numId w:val="3"/>
+          <w:numId w:val="4"/>
         </w:numPr>
       </w:pPr>
       <w:r>
@@ -3422,7 +3440,7 @@
     </w:p>
     <w:p>
       <w:pPr>
-        <w:pStyle w:val="Isian"/>
+        <w:pStyle w:val="Isian1"/>
       </w:pPr>
       <w:r>
         <w:t xml:space="preserve">[Normatif-doktriner, empiris, historis, sosiologis, antropologis, psikologis, atau filologis — sebutkan dan jelaskan alasannya.]</w:t>
@@ -3433,7 +3451,7 @@
         <w:pStyle w:val="Sub1"/>
         <w:numPr>
           <w:ilvl w:val="1"/>
-          <w:numId w:val="3"/>
+          <w:numId w:val="4"/>
         </w:numPr>
       </w:pPr>
       <w:r>
@@ -3442,7 +3460,7 @@
     </w:p>
     <w:p>
       <w:pPr>
-        <w:pStyle w:val="Isian"/>
+        <w:pStyle w:val="Isian1"/>
       </w:pPr>
       <w:r>
         <w:t xml:space="preserve">[Kualitatif atau kuantitatif; eksploratif atau verifikatif; studi kepustakaan atau penelitian lapangan.]</w:t>
@@ -3453,7 +3471,7 @@
         <w:pStyle w:val="Sub1"/>
         <w:numPr>
           <w:ilvl w:val="1"/>
-          <w:numId w:val="3"/>
+          <w:numId w:val="4"/>
         </w:numPr>
       </w:pPr>
       <w:r>
@@ -3462,7 +3480,7 @@
     </w:p>
     <w:p>
       <w:pPr>
-        <w:pStyle w:val="Isian"/>
+        <w:pStyle w:val="Isian1"/>
       </w:pPr>
       <w:r>
         <w:t xml:space="preserve">[Data apa yang dipakai, jenisnya (primer/sekunder), wujudnya, dan dari mana asalnya. Sebutkan nama dokumen atau siapa narasumbernya, bukan sekadar istilah metodologis. Jelaskan juga validitas dan reliabilitasnya.]</w:t>
@@ -3473,7 +3491,7 @@
         <w:pStyle w:val="Sub1"/>
         <w:numPr>
           <w:ilvl w:val="1"/>
-          <w:numId w:val="3"/>
+          <w:numId w:val="4"/>
         </w:numPr>
       </w:pPr>
       <w:r>
@@ -3482,7 +3500,7 @@
     </w:p>
     <w:p>
       <w:pPr>
-        <w:pStyle w:val="Isian"/>
+        <w:pStyle w:val="Isian1"/>
       </w:pPr>
       <w:r>
         <w:t xml:space="preserve">[Observasi atau komunikasi — kuesioner, membaca dokumen, atau interview. Jelaskan bagaimana pelaksanaannya.]</w:t>
@@ -3493,7 +3511,7 @@
         <w:pStyle w:val="Sub1"/>
         <w:numPr>
           <w:ilvl w:val="1"/>
-          <w:numId w:val="3"/>
+          <w:numId w:val="4"/>
         </w:numPr>
       </w:pPr>
       <w:r>
@@ -3502,7 +3520,7 @@
     </w:p>
     <w:p>
       <w:pPr>
-        <w:pStyle w:val="Isian"/>
+        <w:pStyle w:val="Isian1"/>
       </w:pPr>
       <w:r>
         <w:t xml:space="preserve">[Bagaimana data mentah diubah menjadi data terbaca, lalu model analisis yang dipakai. Kerangka teori di Bab II harus menjadi dasar pemilihan model analisis ini.]</w:t>
@@ -3513,7 +3531,7 @@
         <w:pStyle w:val="Sub1"/>
         <w:numPr>
           <w:ilvl w:val="1"/>
-          <w:numId w:val="3"/>
+          <w:numId w:val="4"/>
         </w:numPr>
       </w:pPr>
       <w:r>
@@ -3522,7 +3540,7 @@
     </w:p>
     <w:p>
       <w:pPr>
-        <w:pStyle w:val="IsiTanpaIndent"/>
+        <w:pStyle w:val="Isi1"/>
       </w:pPr>
       <w:r>
         <w:t xml:space="preserve">Penulisan skripsi ini mengacu pada buku Pedoman Penulisan Skripsi Fakultas Syariah dan Hukum Universitas Islam Negeri Syarif Hidayatullah Jakarta tahun 2017.</w:t>
@@ -3533,7 +3551,7 @@
         <w:pStyle w:val="SubA"/>
         <w:numPr>
           <w:ilvl w:val="0"/>
-          <w:numId w:val="3"/>
+          <w:numId w:val="4"/>
         </w:numPr>
       </w:pPr>
       <w:r>
@@ -3594,7 +3612,7 @@
         <w:pStyle w:val="NomorBab"/>
         <w:numPr>
           <w:ilvl w:val="0"/>
-          <w:numId w:val="2"/>
+          <w:numId w:val="3"/>
         </w:numPr>
       </w:pPr>
     </w:p>
@@ -3630,7 +3648,7 @@
         <w:pStyle w:val="SubA"/>
         <w:numPr>
           <w:ilvl w:val="0"/>
-          <w:numId w:val="4"/>
+          <w:numId w:val="5"/>
         </w:numPr>
       </w:pPr>
       <w:r>
@@ -3660,7 +3678,7 @@
         <w:pStyle w:val="ButirIsian"/>
         <w:numPr>
           <w:ilvl w:val="1"/>
-          <w:numId w:val="4"/>
+          <w:numId w:val="5"/>
         </w:numPr>
       </w:pPr>
       <w:r>
@@ -3672,7 +3690,7 @@
         <w:pStyle w:val="ButirIsian"/>
         <w:numPr>
           <w:ilvl w:val="1"/>
-          <w:numId w:val="4"/>
+          <w:numId w:val="5"/>
         </w:numPr>
       </w:pPr>
       <w:r>
@@ -3684,7 +3702,7 @@
         <w:pStyle w:val="ButirIsian"/>
         <w:numPr>
           <w:ilvl w:val="1"/>
-          <w:numId w:val="4"/>
+          <w:numId w:val="5"/>
         </w:numPr>
       </w:pPr>
       <w:r>
@@ -3696,7 +3714,7 @@
         <w:pStyle w:val="SubA"/>
         <w:numPr>
           <w:ilvl w:val="0"/>
-          <w:numId w:val="4"/>
+          <w:numId w:val="5"/>
         </w:numPr>
       </w:pPr>
       <w:r>
@@ -3726,7 +3744,7 @@
         <w:pStyle w:val="Sub1"/>
         <w:numPr>
           <w:ilvl w:val="1"/>
-          <w:numId w:val="4"/>
+          <w:numId w:val="5"/>
         </w:numPr>
       </w:pPr>
       <w:r>
@@ -3735,7 +3753,7 @@
     </w:p>
     <w:p>
       <w:pPr>
-        <w:pStyle w:val="Isian"/>
+        <w:pStyle w:val="Isian1"/>
       </w:pPr>
       <w:r>
         <w:t xml:space="preserve">[Isi teori dan pencetusnya, lalu bagaimana teori ini akan dipakai membaca datamu.]</w:t>
@@ -3746,7 +3764,7 @@
         <w:pStyle w:val="Sub1"/>
         <w:numPr>
           <w:ilvl w:val="1"/>
-          <w:numId w:val="4"/>
+          <w:numId w:val="5"/>
         </w:numPr>
       </w:pPr>
       <w:r>
@@ -3755,7 +3773,7 @@
     </w:p>
     <w:p>
       <w:pPr>
-        <w:pStyle w:val="Isian"/>
+        <w:pStyle w:val="Isian1"/>
       </w:pPr>
       <w:r>
         <w:t xml:space="preserve">[Isi teori kedua dan fungsinya sebagai alat analisis.]</w:t>
@@ -3766,7 +3784,7 @@
         <w:pStyle w:val="SubA"/>
         <w:numPr>
           <w:ilvl w:val="0"/>
-          <w:numId w:val="4"/>
+          <w:numId w:val="5"/>
         </w:numPr>
       </w:pPr>
       <w:r>
@@ -3796,7 +3814,7 @@
         <w:pStyle w:val="Sub1"/>
         <w:numPr>
           <w:ilvl w:val="1"/>
-          <w:numId w:val="4"/>
+          <w:numId w:val="5"/>
         </w:numPr>
       </w:pPr>
       <w:r>
@@ -3805,7 +3823,7 @@
     </w:p>
     <w:p>
       <w:pPr>
-        <w:pStyle w:val="Isian"/>
+        <w:pStyle w:val="Isian1"/>
       </w:pPr>
       <w:r>
         <w:t xml:space="preserve">[Anotasi, kritik, persamaan, dan perbedaan dengan penelitianmu.]</w:t>
@@ -3816,7 +3834,7 @@
         <w:pStyle w:val="Sub1"/>
         <w:numPr>
           <w:ilvl w:val="1"/>
-          <w:numId w:val="4"/>
+          <w:numId w:val="5"/>
         </w:numPr>
       </w:pPr>
       <w:r>
@@ -3825,7 +3843,7 @@
     </w:p>
     <w:p>
       <w:pPr>
-        <w:pStyle w:val="Isian"/>
+        <w:pStyle w:val="Isian1"/>
       </w:pPr>
       <w:r>
         <w:t xml:space="preserve">[Anotasi, kritik, persamaan, dan perbedaan.]</w:t>
@@ -3836,7 +3854,7 @@
         <w:pStyle w:val="Sub1"/>
         <w:numPr>
           <w:ilvl w:val="1"/>
-          <w:numId w:val="4"/>
+          <w:numId w:val="5"/>
         </w:numPr>
       </w:pPr>
       <w:r>
@@ -3845,7 +3863,7 @@
     </w:p>
     <w:p>
       <w:pPr>
-        <w:pStyle w:val="Isian"/>
+        <w:pStyle w:val="Isian1"/>
       </w:pPr>
       <w:r>
         <w:t xml:space="preserve">[Anotasi, kritik, persamaan, dan perbedaan.]</w:t>
@@ -3864,7 +3882,7 @@
         <w:pStyle w:val="SubA"/>
         <w:numPr>
           <w:ilvl w:val="0"/>
-          <w:numId w:val="4"/>
+          <w:numId w:val="5"/>
         </w:numPr>
       </w:pPr>
       <w:r>
@@ -3894,7 +3912,7 @@
         <w:pStyle w:val="Suba"/>
         <w:numPr>
           <w:ilvl w:val="2"/>
-          <w:numId w:val="4"/>
+          <w:numId w:val="5"/>
         </w:numPr>
       </w:pPr>
       <w:r>
@@ -3903,7 +3921,7 @@
     </w:p>
     <w:p>
       <w:pPr>
-        <w:pStyle w:val="Isi"/>
+        <w:pStyle w:val="Isi2"/>
       </w:pPr>
       <w:r>
         <w:t xml:space="preserve">Dijalin menyatu di dalam teks, diberi tanda petik, ditutup superskrip catatan kaki. Teori hukum murni menegaskan bahwa hukum adalah </w:t>
@@ -3926,7 +3944,7 @@
         <w:pStyle w:val="Suba"/>
         <w:numPr>
           <w:ilvl w:val="2"/>
-          <w:numId w:val="4"/>
+          <w:numId w:val="5"/>
         </w:numPr>
       </w:pPr>
       <w:r>
@@ -3935,7 +3953,7 @@
     </w:p>
     <w:p>
       <w:pPr>
-        <w:pStyle w:val="Isi"/>
+        <w:pStyle w:val="Isi2"/>
       </w:pPr>
       <w:r>
         <w:t xml:space="preserve">Ditulis sebagai alinea tersendiri, tanpa tanda petik, satu spasi, baris pertama menjorok 1,27 cm dan baris berikutnya 0,5 cm. Pakai gaya Kutipan Panjang.</w:t>
@@ -3960,7 +3978,7 @@
         <w:pStyle w:val="Suba"/>
         <w:numPr>
           <w:ilvl w:val="2"/>
-          <w:numId w:val="4"/>
+          <w:numId w:val="5"/>
         </w:numPr>
       </w:pPr>
       <w:r>
@@ -3969,7 +3987,7 @@
     </w:p>
     <w:p>
       <w:pPr>
-        <w:pStyle w:val="Isi"/>
+        <w:pStyle w:val="Isi2"/>
       </w:pPr>
       <w:r>
         <w:t xml:space="preserve">Diungkapkan dengan bahasa penulis sendiri, tetap diberi catatan kaki. Bagi Alyasa Abu Bakar, inovasi hukum waris Islam untuk memberi porsi keadilan pada perempuan tidak perlu dilakukan karena hukum Islam yang bersifat qath’i sudah memperhatikan hak-hak perempuan dalam warisan.</w:t>
@@ -4004,7 +4022,7 @@
         <w:pStyle w:val="Suba"/>
         <w:numPr>
           <w:ilvl w:val="2"/>
-          <w:numId w:val="4"/>
+          <w:numId w:val="5"/>
         </w:numPr>
       </w:pPr>
       <w:r>
@@ -4013,7 +4031,7 @@
     </w:p>
     <w:p>
       <w:pPr>
-        <w:pStyle w:val="Isi"/>
+        <w:pStyle w:val="Isi2"/>
       </w:pPr>
       <w:r>
         <w:t xml:space="preserve">Ayat Alquran, Hadis, peraturan perundang-undangan, rumus, dan kaidah wajib dikutip langsung. Ayat ditulis lengkap dengan syakalnya, tanpa catatan kaki — cukup nama surat, nomor surat, dan nomor ayat.</w:t>
@@ -4078,7 +4096,7 @@
         <w:pStyle w:val="NomorBab"/>
         <w:numPr>
           <w:ilvl w:val="0"/>
-          <w:numId w:val="2"/>
+          <w:numId w:val="3"/>
         </w:numPr>
       </w:pPr>
     </w:p>
@@ -4435,7 +4453,7 @@
         <w:pStyle w:val="SubA"/>
         <w:numPr>
           <w:ilvl w:val="0"/>
-          <w:numId w:val="5"/>
+          <w:numId w:val="6"/>
         </w:numPr>
       </w:pPr>
       <w:r>
@@ -4455,7 +4473,7 @@
         <w:pStyle w:val="SubA"/>
         <w:numPr>
           <w:ilvl w:val="0"/>
-          <w:numId w:val="5"/>
+          <w:numId w:val="6"/>
         </w:numPr>
       </w:pPr>
       <w:r>
@@ -4490,7 +4508,7 @@
         <w:pStyle w:val="NomorBab"/>
         <w:numPr>
           <w:ilvl w:val="0"/>
-          <w:numId w:val="2"/>
+          <w:numId w:val="3"/>
         </w:numPr>
       </w:pPr>
     </w:p>
@@ -4526,7 +4544,7 @@
         <w:pStyle w:val="SubA"/>
         <w:numPr>
           <w:ilvl w:val="0"/>
-          <w:numId w:val="6"/>
+          <w:numId w:val="7"/>
         </w:numPr>
       </w:pPr>
       <w:r>
@@ -4554,7 +4572,7 @@
         <w:pStyle w:val="SubA"/>
         <w:numPr>
           <w:ilvl w:val="0"/>
-          <w:numId w:val="6"/>
+          <w:numId w:val="7"/>
         </w:numPr>
       </w:pPr>
       <w:r>
@@ -4574,7 +4592,7 @@
         <w:pStyle w:val="SubA"/>
         <w:numPr>
           <w:ilvl w:val="0"/>
-          <w:numId w:val="6"/>
+          <w:numId w:val="7"/>
         </w:numPr>
       </w:pPr>
       <w:r>
@@ -4627,7 +4645,7 @@
         <w:pStyle w:val="NomorBab"/>
         <w:numPr>
           <w:ilvl w:val="0"/>
-          <w:numId w:val="2"/>
+          <w:numId w:val="3"/>
         </w:numPr>
       </w:pPr>
     </w:p>
@@ -4663,7 +4681,7 @@
         <w:pStyle w:val="SubA"/>
         <w:numPr>
           <w:ilvl w:val="0"/>
-          <w:numId w:val="7"/>
+          <w:numId w:val="8"/>
         </w:numPr>
       </w:pPr>
       <w:r>
@@ -4693,7 +4711,7 @@
         <w:pStyle w:val="ButirIsian"/>
         <w:numPr>
           <w:ilvl w:val="1"/>
-          <w:numId w:val="7"/>
+          <w:numId w:val="8"/>
         </w:numPr>
       </w:pPr>
       <w:r>
@@ -4705,7 +4723,7 @@
         <w:pStyle w:val="ButirIsian"/>
         <w:numPr>
           <w:ilvl w:val="1"/>
-          <w:numId w:val="7"/>
+          <w:numId w:val="8"/>
         </w:numPr>
       </w:pPr>
       <w:r>
@@ -4717,7 +4735,7 @@
         <w:pStyle w:val="SubA"/>
         <w:numPr>
           <w:ilvl w:val="0"/>
-          <w:numId w:val="7"/>
+          <w:numId w:val="8"/>
         </w:numPr>
       </w:pPr>
       <w:r>
@@ -4747,7 +4765,7 @@
         <w:pStyle w:val="ButirIsian"/>
         <w:numPr>
           <w:ilvl w:val="1"/>
-          <w:numId w:val="7"/>
+          <w:numId w:val="8"/>
         </w:numPr>
       </w:pPr>
       <w:r>
@@ -4759,7 +4777,7 @@
         <w:pStyle w:val="ButirIsian"/>
         <w:numPr>
           <w:ilvl w:val="1"/>
-          <w:numId w:val="7"/>
+          <w:numId w:val="8"/>
         </w:numPr>
       </w:pPr>
       <w:r>
@@ -4771,7 +4789,7 @@
         <w:pStyle w:val="ButirIsian"/>
         <w:numPr>
           <w:ilvl w:val="1"/>
-          <w:numId w:val="7"/>
+          <w:numId w:val="8"/>
         </w:numPr>
       </w:pPr>
       <w:r>
@@ -4783,7 +4801,7 @@
         <w:pStyle w:val="SubA"/>
         <w:numPr>
           <w:ilvl w:val="0"/>
-          <w:numId w:val="7"/>
+          <w:numId w:val="8"/>
         </w:numPr>
       </w:pPr>
       <w:r>
@@ -4984,7 +5002,7 @@
     <w:p>
       <w:pPr>
         <w:pStyle w:val="Isian"/>
-        <w:ind w:firstLine="0"/>
+        <w:ind w:left="0" w:firstLine="0"/>
       </w:pPr>
       <w:r>
         <w:t xml:space="preserve">[Lanjutkan entri daftar pustakamu mengikuti pola enam contoh di atas.]</w:t>
@@ -5086,7 +5104,7 @@
     <w:p>
       <w:pPr>
         <w:pStyle w:val="Isian"/>
-        <w:ind w:firstLine="0"/>
+        <w:ind w:left="0" w:firstLine="0"/>
       </w:pPr>
       <w:r>
         <w:t xml:space="preserve">[Lampiran 1  Judul lampiran pertama]</w:t>
@@ -5095,7 +5113,7 @@
     <w:p>
       <w:pPr>
         <w:pStyle w:val="Isian"/>
-        <w:ind w:firstLine="0"/>
+        <w:ind w:left="0" w:firstLine="0"/>
       </w:pPr>
       <w:r>
         <w:t xml:space="preserve">[Lampiran 2  Judul lampiran kedua]</w:t>
@@ -5104,7 +5122,7 @@
     <w:p>
       <w:pPr>
         <w:pStyle w:val="Isian"/>
-        <w:ind w:firstLine="0"/>
+        <w:ind w:left="0" w:firstLine="0"/>
       </w:pPr>
       <w:r>
         <w:t xml:space="preserve">[Lampiran 3  Judul lampiran ketiga]</w:t>
@@ -6700,65 +6718,11 @@
     <w:multiLevelType w:val="hybridMultilevel"/>
     <w:lvl w:ilvl="0" w15:tentative="1">
       <w:start w:val="1"/>
-      <w:numFmt w:val="upperLetter"/>
+      <w:numFmt w:val="decimal"/>
       <w:lvlText w:val="%1."/>
       <w:lvlJc w:val="start"/>
       <w:pPr>
         <w:ind w:left="454" w:hanging="454"/>
-      </w:pPr>
-    </w:lvl>
-    <w:lvl w:ilvl="1" w15:tentative="1">
-      <w:start w:val="1"/>
-      <w:numFmt w:val="decimal"/>
-      <w:lvlText w:val="%2."/>
-      <w:lvlJc w:val="start"/>
-      <w:pPr>
-        <w:ind w:left="907" w:hanging="454"/>
-      </w:pPr>
-    </w:lvl>
-    <w:lvl w:ilvl="2" w15:tentative="1">
-      <w:start w:val="1"/>
-      <w:numFmt w:val="lowerLetter"/>
-      <w:lvlText w:val="%3."/>
-      <w:lvlJc w:val="start"/>
-      <w:pPr>
-        <w:ind w:left="1361" w:hanging="454"/>
-      </w:pPr>
-    </w:lvl>
-    <w:lvl w:ilvl="3" w15:tentative="1">
-      <w:start w:val="1"/>
-      <w:numFmt w:val="decimal"/>
-      <w:lvlText w:val="%4)"/>
-      <w:lvlJc w:val="start"/>
-      <w:pPr>
-        <w:ind w:left="1814" w:hanging="454"/>
-      </w:pPr>
-    </w:lvl>
-    <w:lvl w:ilvl="4" w15:tentative="1">
-      <w:start w:val="1"/>
-      <w:numFmt w:val="lowerLetter"/>
-      <w:lvlText w:val="%5)"/>
-      <w:lvlJc w:val="start"/>
-      <w:pPr>
-        <w:ind w:left="2268" w:hanging="454"/>
-      </w:pPr>
-    </w:lvl>
-    <w:lvl w:ilvl="5" w15:tentative="1">
-      <w:start w:val="1"/>
-      <w:numFmt w:val="decimal"/>
-      <w:lvlText w:val="(%6)"/>
-      <w:lvlJc w:val="start"/>
-      <w:pPr>
-        <w:ind w:left="2778" w:hanging="510"/>
-      </w:pPr>
-    </w:lvl>
-    <w:lvl w:ilvl="6" w15:tentative="1">
-      <w:start w:val="1"/>
-      <w:numFmt w:val="lowerLetter"/>
-      <w:lvlText w:val="(%7)"/>
-      <w:lvlJc w:val="start"/>
-      <w:pPr>
-        <w:ind w:left="3288" w:hanging="510"/>
       </w:pPr>
     </w:lvl>
   </w:abstractNum>
@@ -7026,6 +6990,72 @@
       </w:pPr>
     </w:lvl>
   </w:abstractNum>
+  <w:abstractNum w:abstractNumId="8" w15:restartNumberingAfterBreak="0">
+    <w:multiLevelType w:val="hybridMultilevel"/>
+    <w:lvl w:ilvl="0" w15:tentative="1">
+      <w:start w:val="1"/>
+      <w:numFmt w:val="upperLetter"/>
+      <w:lvlText w:val="%1."/>
+      <w:lvlJc w:val="start"/>
+      <w:pPr>
+        <w:ind w:left="454" w:hanging="454"/>
+      </w:pPr>
+    </w:lvl>
+    <w:lvl w:ilvl="1" w15:tentative="1">
+      <w:start w:val="1"/>
+      <w:numFmt w:val="decimal"/>
+      <w:lvlText w:val="%2."/>
+      <w:lvlJc w:val="start"/>
+      <w:pPr>
+        <w:ind w:left="907" w:hanging="454"/>
+      </w:pPr>
+    </w:lvl>
+    <w:lvl w:ilvl="2" w15:tentative="1">
+      <w:start w:val="1"/>
+      <w:numFmt w:val="lowerLetter"/>
+      <w:lvlText w:val="%3."/>
+      <w:lvlJc w:val="start"/>
+      <w:pPr>
+        <w:ind w:left="1361" w:hanging="454"/>
+      </w:pPr>
+    </w:lvl>
+    <w:lvl w:ilvl="3" w15:tentative="1">
+      <w:start w:val="1"/>
+      <w:numFmt w:val="decimal"/>
+      <w:lvlText w:val="%4)"/>
+      <w:lvlJc w:val="start"/>
+      <w:pPr>
+        <w:ind w:left="1814" w:hanging="454"/>
+      </w:pPr>
+    </w:lvl>
+    <w:lvl w:ilvl="4" w15:tentative="1">
+      <w:start w:val="1"/>
+      <w:numFmt w:val="lowerLetter"/>
+      <w:lvlText w:val="%5)"/>
+      <w:lvlJc w:val="start"/>
+      <w:pPr>
+        <w:ind w:left="2268" w:hanging="454"/>
+      </w:pPr>
+    </w:lvl>
+    <w:lvl w:ilvl="5" w15:tentative="1">
+      <w:start w:val="1"/>
+      <w:numFmt w:val="decimal"/>
+      <w:lvlText w:val="(%6)"/>
+      <w:lvlJc w:val="start"/>
+      <w:pPr>
+        <w:ind w:left="2778" w:hanging="510"/>
+      </w:pPr>
+    </w:lvl>
+    <w:lvl w:ilvl="6" w15:tentative="1">
+      <w:start w:val="1"/>
+      <w:numFmt w:val="lowerLetter"/>
+      <w:lvlText w:val="(%7)"/>
+      <w:lvlJc w:val="start"/>
+      <w:pPr>
+        <w:ind w:left="3288" w:hanging="510"/>
+      </w:pPr>
+    </w:lvl>
+  </w:abstractNum>
   <w:num w:numId="1">
     <w:abstractNumId w:val="1"/>
     <w:lvlOverride w:ilvl="0">
@@ -7033,13 +7063,13 @@
     </w:lvlOverride>
   </w:num>
   <w:num w:numId="2">
-    <w:abstractNumId w:val="2"/>
+    <w:abstractNumId w:val="3"/>
     <w:lvlOverride w:ilvl="0">
       <w:startOverride w:val="1"/>
     </w:lvlOverride>
   </w:num>
   <w:num w:numId="3">
-    <w:abstractNumId w:val="3"/>
+    <w:abstractNumId w:val="2"/>
     <w:lvlOverride w:ilvl="0">
       <w:startOverride w:val="1"/>
     </w:lvlOverride>
@@ -7064,6 +7094,12 @@
   </w:num>
   <w:num w:numId="7">
     <w:abstractNumId w:val="7"/>
+    <w:lvlOverride w:ilvl="0">
+      <w:startOverride w:val="1"/>
+    </w:lvlOverride>
+  </w:num>
+  <w:num w:numId="8">
+    <w:abstractNumId w:val="8"/>
     <w:lvlOverride w:ilvl="0">
       <w:startOverride w:val="1"/>
     </w:lvlOverride>
@@ -7291,6 +7327,70 @@
     </w:pPr>
     <w:rPr>
       <w:rFonts w:ascii="Times New Roman" w:cs="Times New Roman" w:eastAsia="Times New Roman" w:hAnsi="Times New Roman"/>
+      <w:sz w:val="24"/>
+      <w:szCs w:val="24"/>
+    </w:rPr>
+  </w:style>
+  <w:style w:type="paragraph" w:styleId="Isi1">
+    <w:name w:val="Isi Naskah Tingkat 1"/>
+    <w:basedOn w:val="Normal"/>
+    <w:next w:val="Isi1"/>
+    <w:qFormat/>
+    <w:pPr>
+      <w:spacing w:after="0" w:line="360" w:lineRule="auto"/>
+      <w:ind w:left="454" w:firstLine="720"/>
+      <w:jc w:val="both"/>
+    </w:pPr>
+    <w:rPr>
+      <w:rFonts w:ascii="Times New Roman" w:cs="Times New Roman" w:eastAsia="Times New Roman" w:hAnsi="Times New Roman"/>
+      <w:sz w:val="24"/>
+      <w:szCs w:val="24"/>
+    </w:rPr>
+  </w:style>
+  <w:style w:type="paragraph" w:styleId="Isi2">
+    <w:name w:val="Isi Naskah Tingkat 2"/>
+    <w:basedOn w:val="Normal"/>
+    <w:next w:val="Isi2"/>
+    <w:qFormat/>
+    <w:pPr>
+      <w:spacing w:after="0" w:line="360" w:lineRule="auto"/>
+      <w:ind w:left="907" w:firstLine="720"/>
+      <w:jc w:val="both"/>
+    </w:pPr>
+    <w:rPr>
+      <w:rFonts w:ascii="Times New Roman" w:cs="Times New Roman" w:eastAsia="Times New Roman" w:hAnsi="Times New Roman"/>
+      <w:sz w:val="24"/>
+      <w:szCs w:val="24"/>
+    </w:rPr>
+  </w:style>
+  <w:style w:type="paragraph" w:styleId="Isian1">
+    <w:name w:val="Isian Tingkat 1"/>
+    <w:basedOn w:val="Normal"/>
+    <w:next w:val="Isi1"/>
+    <w:pPr>
+      <w:spacing w:after="0" w:line="360" w:lineRule="auto"/>
+      <w:ind w:left="454" w:firstLine="720"/>
+      <w:jc w:val="both"/>
+    </w:pPr>
+    <w:rPr>
+      <w:rFonts w:ascii="Times New Roman" w:cs="Times New Roman" w:eastAsia="Times New Roman" w:hAnsi="Times New Roman"/>
+      <w:color w:val="8A8A8A"/>
+      <w:sz w:val="24"/>
+      <w:szCs w:val="24"/>
+    </w:rPr>
+  </w:style>
+  <w:style w:type="paragraph" w:styleId="Isian2">
+    <w:name w:val="Isian Tingkat 2"/>
+    <w:basedOn w:val="Normal"/>
+    <w:next w:val="Isi2"/>
+    <w:pPr>
+      <w:spacing w:after="0" w:line="360" w:lineRule="auto"/>
+      <w:ind w:left="907" w:firstLine="720"/>
+      <w:jc w:val="both"/>
+    </w:pPr>
+    <w:rPr>
+      <w:rFonts w:ascii="Times New Roman" w:cs="Times New Roman" w:eastAsia="Times New Roman" w:hAnsi="Times New Roman"/>
+      <w:color w:val="8A8A8A"/>
       <w:sz w:val="24"/>
       <w:szCs w:val="24"/>
     </w:rPr>

</xml_diff>